<commit_message>
User Guide - Hyperlink attached
</commit_message>
<xml_diff>
--- a/User Guide/Matkenn-ERPSystem.docx
+++ b/User Guide/Matkenn-ERPSystem.docx
@@ -172,13 +172,34 @@
           <w:szCs w:val="24"/>
         </w:rPr>
       </w:pPr>
-      <w:r>
-        <w:rPr>
-          <w:sz w:val="24"/>
-          <w:szCs w:val="24"/>
-        </w:rPr>
-        <w:t>Espressif Flash Download Tool</w:t>
-      </w:r>
+      <w:hyperlink r:id="rId5" w:history="1">
+        <w:r>
+          <w:rPr>
+            <w:rStyle w:val="Hyperlink"/>
+            <w:sz w:val="24"/>
+            <w:szCs w:val="24"/>
+          </w:rPr>
+          <w:t>Espressif Flash Downl</w:t>
+        </w:r>
+        <w:r>
+          <w:rPr>
+            <w:rStyle w:val="Hyperlink"/>
+            <w:sz w:val="24"/>
+            <w:szCs w:val="24"/>
+          </w:rPr>
+          <w:t>o</w:t>
+        </w:r>
+        <w:r>
+          <w:rPr>
+            <w:rStyle w:val="Hyperlink"/>
+            <w:sz w:val="24"/>
+            <w:szCs w:val="24"/>
+          </w:rPr>
+          <w:t>ad Tool</w:t>
+        </w:r>
+      </w:hyperlink>
+      <w:bookmarkStart w:id="0" w:name="_GoBack"/>
+      <w:bookmarkEnd w:id="0"/>
     </w:p>
     <w:p>
       <w:pPr>
@@ -192,13 +213,16 @@
           <w:szCs w:val="24"/>
         </w:rPr>
       </w:pPr>
-      <w:r>
-        <w:rPr>
-          <w:sz w:val="24"/>
-          <w:szCs w:val="24"/>
-        </w:rPr>
-        <w:t>Putty</w:t>
-      </w:r>
+      <w:hyperlink r:id="rId6" w:history="1">
+        <w:r>
+          <w:rPr>
+            <w:rStyle w:val="Hyperlink"/>
+            <w:sz w:val="24"/>
+            <w:szCs w:val="24"/>
+          </w:rPr>
+          <w:t>Putty</w:t>
+        </w:r>
+      </w:hyperlink>
     </w:p>
     <w:p>
       <w:pPr>
@@ -257,7 +281,7 @@
                     <pic:cNvPicPr/>
                   </pic:nvPicPr>
                   <pic:blipFill>
-                    <a:blip r:embed="rId5" cstate="print">
+                    <a:blip r:embed="rId7" cstate="print">
                       <a:extLst>
                         <a:ext uri="{28A0092B-C50C-407E-A947-70E740481C1C}">
                           <a14:useLocalDpi xmlns:a14="http://schemas.microsoft.com/office/drawing/2010/main" val="0"/>
@@ -302,163 +326,6 @@
             <wp:extent cx="3559398" cy="3121888"/>
             <wp:effectExtent l="0" t="0" r="3175" b="2540"/>
             <wp:docPr id="287601685" name="Picture 287601685"/>
-            <wp:cNvGraphicFramePr>
-              <a:graphicFrameLocks xmlns:a="http://schemas.openxmlformats.org/drawingml/2006/main" noChangeAspect="1"/>
-            </wp:cNvGraphicFramePr>
-            <a:graphic xmlns:a="http://schemas.openxmlformats.org/drawingml/2006/main">
-              <a:graphicData uri="http://schemas.openxmlformats.org/drawingml/2006/picture">
-                <pic:pic xmlns:pic="http://schemas.openxmlformats.org/drawingml/2006/picture">
-                  <pic:nvPicPr>
-                    <pic:cNvPr id="0" name=""/>
-                    <pic:cNvPicPr/>
-                  </pic:nvPicPr>
-                  <pic:blipFill>
-                    <a:blip r:embed="rId6">
-                      <a:extLst>
-                        <a:ext uri="{28A0092B-C50C-407E-A947-70E740481C1C}">
-                          <a14:useLocalDpi xmlns:a14="http://schemas.microsoft.com/office/drawing/2010/main" val="0"/>
-                        </a:ext>
-                      </a:extLst>
-                    </a:blip>
-                    <a:stretch>
-                      <a:fillRect/>
-                    </a:stretch>
-                  </pic:blipFill>
-                  <pic:spPr>
-                    <a:xfrm>
-                      <a:off x="0" y="0"/>
-                      <a:ext cx="3623221" cy="3177866"/>
-                    </a:xfrm>
-                    <a:prstGeom prst="rect">
-                      <a:avLst/>
-                    </a:prstGeom>
-                  </pic:spPr>
-                </pic:pic>
-              </a:graphicData>
-            </a:graphic>
-          </wp:inline>
-        </w:drawing>
-      </w:r>
-    </w:p>
-    <w:p>
-      <w:r>
-        <w:lastRenderedPageBreak/>
-        <w:t>Connect Leds and Push Buttons with the above circuit, by using breadboard and jumper-wires.</w:t>
-      </w:r>
-    </w:p>
-    <w:p>
-      <w:pPr>
-        <w:jc w:val="center"/>
-      </w:pPr>
-      <w:r>
-        <w:rPr>
-          <w:noProof/>
-        </w:rPr>
-        <w:drawing>
-          <wp:inline distT="0" distB="0" distL="0" distR="0" wp14:anchorId="7D0368F6" wp14:editId="714F0AB6">
-            <wp:extent cx="4359919" cy="2321626"/>
-            <wp:effectExtent l="0" t="0" r="2540" b="2540"/>
-            <wp:docPr id="501008296" name="Picture 501008296"/>
-            <wp:cNvGraphicFramePr>
-              <a:graphicFrameLocks xmlns:a="http://schemas.openxmlformats.org/drawingml/2006/main" noChangeAspect="1"/>
-            </wp:cNvGraphicFramePr>
-            <a:graphic xmlns:a="http://schemas.openxmlformats.org/drawingml/2006/main">
-              <a:graphicData uri="http://schemas.openxmlformats.org/drawingml/2006/picture">
-                <pic:pic xmlns:pic="http://schemas.openxmlformats.org/drawingml/2006/picture">
-                  <pic:nvPicPr>
-                    <pic:cNvPr id="0" name=""/>
-                    <pic:cNvPicPr/>
-                  </pic:nvPicPr>
-                  <pic:blipFill>
-                    <a:blip r:embed="rId7">
-                      <a:extLst>
-                        <a:ext uri="{28A0092B-C50C-407E-A947-70E740481C1C}">
-                          <a14:useLocalDpi xmlns:a14="http://schemas.microsoft.com/office/drawing/2010/main" val="0"/>
-                        </a:ext>
-                      </a:extLst>
-                    </a:blip>
-                    <a:stretch>
-                      <a:fillRect/>
-                    </a:stretch>
-                  </pic:blipFill>
-                  <pic:spPr>
-                    <a:xfrm>
-                      <a:off x="0" y="0"/>
-                      <a:ext cx="4411985" cy="2349351"/>
-                    </a:xfrm>
-                    <a:prstGeom prst="rect">
-                      <a:avLst/>
-                    </a:prstGeom>
-                  </pic:spPr>
-                </pic:pic>
-              </a:graphicData>
-            </a:graphic>
-          </wp:inline>
-        </w:drawing>
-      </w:r>
-    </w:p>
-    <w:p>
-      <w:r>
-        <w:rPr>
-          <w:b/>
-          <w:bCs/>
-          <w:sz w:val="32"/>
-          <w:szCs w:val="32"/>
-        </w:rPr>
-        <w:t>FIRMWARE UPLOAD &amp; TESTING:</w:t>
-      </w:r>
-    </w:p>
-    <w:p>
-      <w:r>
-        <w:t xml:space="preserve">First you have to connect the </w:t>
-      </w:r>
-      <w:r>
-        <w:rPr>
-          <w:b/>
-        </w:rPr>
-        <w:t>GPIO0</w:t>
-      </w:r>
-      <w:r>
-        <w:t xml:space="preserve"> to </w:t>
-      </w:r>
-      <w:r>
-        <w:rPr>
-          <w:b/>
-        </w:rPr>
-        <w:t>GND</w:t>
-      </w:r>
-      <w:r>
-        <w:t xml:space="preserve"> and press the reset button of the ESP32-Cam board for “</w:t>
-      </w:r>
-      <w:r>
-        <w:rPr>
-          <w:b/>
-        </w:rPr>
-        <w:t>FLASH MODE</w:t>
-      </w:r>
-      <w:r>
-        <w:t xml:space="preserve">”. </w:t>
-      </w:r>
-      <w:r>
-        <w:br/>
-      </w:r>
-      <w:r>
-        <w:t>Insert the USB-To-TTL Converter into the PC USB-Port.</w:t>
-      </w:r>
-    </w:p>
-    <w:p>
-      <w:pPr>
-        <w:jc w:val="center"/>
-      </w:pPr>
-      <w:r>
-        <w:rPr>
-          <w:noProof/>
-        </w:rPr>
-        <w:drawing>
-          <wp:inline distT="0" distB="0" distL="0" distR="0" wp14:anchorId="73118C86" wp14:editId="560BC0EE">
-            <wp:extent cx="5610386" cy="3448050"/>
-            <wp:effectExtent l="0" t="0" r="0" b="0"/>
-            <wp:docPr id="1109547241" name="Picture 1109547241"/>
             <wp:cNvGraphicFramePr>
               <a:graphicFrameLocks xmlns:a="http://schemas.openxmlformats.org/drawingml/2006/main" noChangeAspect="1"/>
             </wp:cNvGraphicFramePr>
@@ -484,6 +351,163 @@
                   <pic:spPr>
                     <a:xfrm>
                       <a:off x="0" y="0"/>
+                      <a:ext cx="3623221" cy="3177866"/>
+                    </a:xfrm>
+                    <a:prstGeom prst="rect">
+                      <a:avLst/>
+                    </a:prstGeom>
+                  </pic:spPr>
+                </pic:pic>
+              </a:graphicData>
+            </a:graphic>
+          </wp:inline>
+        </w:drawing>
+      </w:r>
+    </w:p>
+    <w:p>
+      <w:r>
+        <w:lastRenderedPageBreak/>
+        <w:t>Connect Leds and Push Buttons with the above circuit, by using breadboard and jumper-wires.</w:t>
+      </w:r>
+    </w:p>
+    <w:p>
+      <w:pPr>
+        <w:jc w:val="center"/>
+      </w:pPr>
+      <w:r>
+        <w:rPr>
+          <w:noProof/>
+        </w:rPr>
+        <w:drawing>
+          <wp:inline distT="0" distB="0" distL="0" distR="0" wp14:anchorId="7D0368F6" wp14:editId="714F0AB6">
+            <wp:extent cx="4359919" cy="2321626"/>
+            <wp:effectExtent l="0" t="0" r="2540" b="2540"/>
+            <wp:docPr id="501008296" name="Picture 501008296"/>
+            <wp:cNvGraphicFramePr>
+              <a:graphicFrameLocks xmlns:a="http://schemas.openxmlformats.org/drawingml/2006/main" noChangeAspect="1"/>
+            </wp:cNvGraphicFramePr>
+            <a:graphic xmlns:a="http://schemas.openxmlformats.org/drawingml/2006/main">
+              <a:graphicData uri="http://schemas.openxmlformats.org/drawingml/2006/picture">
+                <pic:pic xmlns:pic="http://schemas.openxmlformats.org/drawingml/2006/picture">
+                  <pic:nvPicPr>
+                    <pic:cNvPr id="0" name=""/>
+                    <pic:cNvPicPr/>
+                  </pic:nvPicPr>
+                  <pic:blipFill>
+                    <a:blip r:embed="rId9">
+                      <a:extLst>
+                        <a:ext uri="{28A0092B-C50C-407E-A947-70E740481C1C}">
+                          <a14:useLocalDpi xmlns:a14="http://schemas.microsoft.com/office/drawing/2010/main" val="0"/>
+                        </a:ext>
+                      </a:extLst>
+                    </a:blip>
+                    <a:stretch>
+                      <a:fillRect/>
+                    </a:stretch>
+                  </pic:blipFill>
+                  <pic:spPr>
+                    <a:xfrm>
+                      <a:off x="0" y="0"/>
+                      <a:ext cx="4411985" cy="2349351"/>
+                    </a:xfrm>
+                    <a:prstGeom prst="rect">
+                      <a:avLst/>
+                    </a:prstGeom>
+                  </pic:spPr>
+                </pic:pic>
+              </a:graphicData>
+            </a:graphic>
+          </wp:inline>
+        </w:drawing>
+      </w:r>
+    </w:p>
+    <w:p>
+      <w:r>
+        <w:rPr>
+          <w:b/>
+          <w:bCs/>
+          <w:sz w:val="32"/>
+          <w:szCs w:val="32"/>
+        </w:rPr>
+        <w:t>FIRMWARE UPLOAD &amp; TESTING:</w:t>
+      </w:r>
+    </w:p>
+    <w:p>
+      <w:r>
+        <w:t xml:space="preserve">First you have to connect the </w:t>
+      </w:r>
+      <w:r>
+        <w:rPr>
+          <w:b/>
+        </w:rPr>
+        <w:t>GPIO0</w:t>
+      </w:r>
+      <w:r>
+        <w:t xml:space="preserve"> to </w:t>
+      </w:r>
+      <w:r>
+        <w:rPr>
+          <w:b/>
+        </w:rPr>
+        <w:t>GND</w:t>
+      </w:r>
+      <w:r>
+        <w:t xml:space="preserve"> and press the reset button of the ESP32-Cam board for “</w:t>
+      </w:r>
+      <w:r>
+        <w:rPr>
+          <w:b/>
+        </w:rPr>
+        <w:t>FLASH MODE</w:t>
+      </w:r>
+      <w:r>
+        <w:t xml:space="preserve">”. </w:t>
+      </w:r>
+      <w:r>
+        <w:br/>
+      </w:r>
+      <w:r>
+        <w:t>Insert the USB-To-TTL Converter into the PC USB-Port.</w:t>
+      </w:r>
+    </w:p>
+    <w:p>
+      <w:pPr>
+        <w:jc w:val="center"/>
+      </w:pPr>
+      <w:r>
+        <w:rPr>
+          <w:noProof/>
+        </w:rPr>
+        <w:drawing>
+          <wp:inline distT="0" distB="0" distL="0" distR="0" wp14:anchorId="73118C86" wp14:editId="560BC0EE">
+            <wp:extent cx="5610386" cy="3448050"/>
+            <wp:effectExtent l="0" t="0" r="0" b="0"/>
+            <wp:docPr id="1109547241" name="Picture 1109547241"/>
+            <wp:cNvGraphicFramePr>
+              <a:graphicFrameLocks xmlns:a="http://schemas.openxmlformats.org/drawingml/2006/main" noChangeAspect="1"/>
+            </wp:cNvGraphicFramePr>
+            <a:graphic xmlns:a="http://schemas.openxmlformats.org/drawingml/2006/main">
+              <a:graphicData uri="http://schemas.openxmlformats.org/drawingml/2006/picture">
+                <pic:pic xmlns:pic="http://schemas.openxmlformats.org/drawingml/2006/picture">
+                  <pic:nvPicPr>
+                    <pic:cNvPr id="0" name=""/>
+                    <pic:cNvPicPr/>
+                  </pic:nvPicPr>
+                  <pic:blipFill>
+                    <a:blip r:embed="rId10">
+                      <a:extLst>
+                        <a:ext uri="{28A0092B-C50C-407E-A947-70E740481C1C}">
+                          <a14:useLocalDpi xmlns:a14="http://schemas.microsoft.com/office/drawing/2010/main" val="0"/>
+                        </a:ext>
+                      </a:extLst>
+                    </a:blip>
+                    <a:stretch>
+                      <a:fillRect/>
+                    </a:stretch>
+                  </pic:blipFill>
+                  <pic:spPr>
+                    <a:xfrm>
+                      <a:off x="0" y="0"/>
                       <a:ext cx="5610386" cy="3448050"/>
                     </a:xfrm>
                     <a:prstGeom prst="rect">
@@ -535,7 +559,7 @@
                     <pic:cNvPicPr/>
                   </pic:nvPicPr>
                   <pic:blipFill rotWithShape="1">
-                    <a:blip r:embed="rId9">
+                    <a:blip r:embed="rId11">
                       <a:extLst>
                         <a:ext uri="{28A0092B-C50C-407E-A947-70E740481C1C}">
                           <a14:useLocalDpi xmlns:a14="http://schemas.microsoft.com/office/drawing/2010/main" val="0"/>
@@ -605,7 +629,7 @@
                     <pic:cNvPicPr/>
                   </pic:nvPicPr>
                   <pic:blipFill>
-                    <a:blip r:embed="rId10">
+                    <a:blip r:embed="rId12">
                       <a:extLst>
                         <a:ext uri="{28A0092B-C50C-407E-A947-70E740481C1C}">
                           <a14:useLocalDpi xmlns:a14="http://schemas.microsoft.com/office/drawing/2010/main" val="0"/>
@@ -666,153 +690,6 @@
             <wp:extent cx="2616155" cy="4037798"/>
             <wp:effectExtent l="0" t="0" r="0" b="1270"/>
             <wp:docPr id="1151067647" name="Picture 1151067647"/>
-            <wp:cNvGraphicFramePr>
-              <a:graphicFrameLocks xmlns:a="http://schemas.openxmlformats.org/drawingml/2006/main" noChangeAspect="1"/>
-            </wp:cNvGraphicFramePr>
-            <a:graphic xmlns:a="http://schemas.openxmlformats.org/drawingml/2006/main">
-              <a:graphicData uri="http://schemas.openxmlformats.org/drawingml/2006/picture">
-                <pic:pic xmlns:pic="http://schemas.openxmlformats.org/drawingml/2006/picture">
-                  <pic:nvPicPr>
-                    <pic:cNvPr id="0" name=""/>
-                    <pic:cNvPicPr/>
-                  </pic:nvPicPr>
-                  <pic:blipFill>
-                    <a:blip r:embed="rId11">
-                      <a:extLst>
-                        <a:ext uri="{28A0092B-C50C-407E-A947-70E740481C1C}">
-                          <a14:useLocalDpi xmlns:a14="http://schemas.microsoft.com/office/drawing/2010/main" val="0"/>
-                        </a:ext>
-                      </a:extLst>
-                    </a:blip>
-                    <a:stretch>
-                      <a:fillRect/>
-                    </a:stretch>
-                  </pic:blipFill>
-                  <pic:spPr>
-                    <a:xfrm>
-                      <a:off x="0" y="0"/>
-                      <a:ext cx="2633930" cy="4065232"/>
-                    </a:xfrm>
-                    <a:prstGeom prst="rect">
-                      <a:avLst/>
-                    </a:prstGeom>
-                  </pic:spPr>
-                </pic:pic>
-              </a:graphicData>
-            </a:graphic>
-          </wp:inline>
-        </w:drawing>
-      </w:r>
-    </w:p>
-    <w:p>
-      <w:pPr>
-        <w:jc w:val="both"/>
-      </w:pPr>
-      <w:r>
-        <w:lastRenderedPageBreak/>
-        <w:t xml:space="preserve">Select the </w:t>
-      </w:r>
-      <w:r>
-        <w:t>“</w:t>
-      </w:r>
-      <w:r>
-        <w:rPr>
-          <w:b/>
-        </w:rPr>
-        <w:t>bin files</w:t>
-      </w:r>
-      <w:r>
-        <w:rPr>
-          <w:b/>
-        </w:rPr>
-        <w:t>”</w:t>
-      </w:r>
-      <w:r>
-        <w:t xml:space="preserve"> in the following order and insert the </w:t>
-      </w:r>
-      <w:r>
-        <w:t>“</w:t>
-      </w:r>
-      <w:r>
-        <w:rPr>
-          <w:b/>
-        </w:rPr>
-        <w:t>values</w:t>
-      </w:r>
-      <w:r>
-        <w:rPr>
-          <w:b/>
-        </w:rPr>
-        <w:t>”</w:t>
-      </w:r>
-      <w:r>
-        <w:t xml:space="preserve"> as shown below.</w:t>
-      </w:r>
-    </w:p>
-    <w:p>
-      <w:pPr>
-        <w:jc w:val="center"/>
-      </w:pPr>
-      <w:r>
-        <w:rPr>
-          <w:noProof/>
-        </w:rPr>
-        <w:drawing>
-          <wp:inline distT="0" distB="0" distL="0" distR="0" wp14:anchorId="5ACFFF2F" wp14:editId="28102712">
-            <wp:extent cx="6199909" cy="1692059"/>
-            <wp:effectExtent l="0" t="0" r="0" b="0"/>
-            <wp:docPr id="1894036528" name="Picture 1894036528"/>
-            <wp:cNvGraphicFramePr>
-              <a:graphicFrameLocks xmlns:a="http://schemas.openxmlformats.org/drawingml/2006/main" noChangeAspect="1"/>
-            </wp:cNvGraphicFramePr>
-            <a:graphic xmlns:a="http://schemas.openxmlformats.org/drawingml/2006/main">
-              <a:graphicData uri="http://schemas.openxmlformats.org/drawingml/2006/picture">
-                <pic:pic xmlns:pic="http://schemas.openxmlformats.org/drawingml/2006/picture">
-                  <pic:nvPicPr>
-                    <pic:cNvPr id="0" name=""/>
-                    <pic:cNvPicPr/>
-                  </pic:nvPicPr>
-                  <pic:blipFill>
-                    <a:blip r:embed="rId12">
-                      <a:extLst>
-                        <a:ext uri="{28A0092B-C50C-407E-A947-70E740481C1C}">
-                          <a14:useLocalDpi xmlns:a14="http://schemas.microsoft.com/office/drawing/2010/main" val="0"/>
-                        </a:ext>
-                      </a:extLst>
-                    </a:blip>
-                    <a:stretch>
-                      <a:fillRect/>
-                    </a:stretch>
-                  </pic:blipFill>
-                  <pic:spPr>
-                    <a:xfrm>
-                      <a:off x="0" y="0"/>
-                      <a:ext cx="6199909" cy="1692059"/>
-                    </a:xfrm>
-                    <a:prstGeom prst="rect">
-                      <a:avLst/>
-                    </a:prstGeom>
-                  </pic:spPr>
-                </pic:pic>
-              </a:graphicData>
-            </a:graphic>
-          </wp:inline>
-        </w:drawing>
-      </w:r>
-    </w:p>
-    <w:p>
-      <w:pPr>
-        <w:jc w:val="center"/>
-      </w:pPr>
-      <w:r>
-        <w:rPr>
-          <w:noProof/>
-        </w:rPr>
-        <w:drawing>
-          <wp:inline distT="0" distB="0" distL="0" distR="0" wp14:anchorId="4F7FBF69" wp14:editId="4EB8B567">
-            <wp:extent cx="2968307" cy="1948818"/>
-            <wp:effectExtent l="0" t="0" r="3810" b="0"/>
-            <wp:docPr id="2026176566" name="Picture 2026176566"/>
             <wp:cNvGraphicFramePr>
               <a:graphicFrameLocks xmlns:a="http://schemas.openxmlformats.org/drawingml/2006/main" noChangeAspect="1"/>
             </wp:cNvGraphicFramePr>
@@ -838,7 +715,7 @@
                   <pic:spPr>
                     <a:xfrm>
                       <a:off x="0" y="0"/>
-                      <a:ext cx="2993029" cy="1965049"/>
+                      <a:ext cx="2633930" cy="4065232"/>
                     </a:xfrm>
                     <a:prstGeom prst="rect">
                       <a:avLst/>
@@ -856,16 +733,44 @@
         <w:jc w:val="both"/>
       </w:pPr>
       <w:r>
-        <w:t>Click on the “</w:t>
-      </w:r>
-      <w:r>
-        <w:rPr>
-          <w:b/>
-        </w:rPr>
-        <w:t>Start</w:t>
-      </w:r>
-      <w:r>
-        <w:t>” button &amp; the firmware begins uploading.</w:t>
+        <w:lastRenderedPageBreak/>
+        <w:t xml:space="preserve">Select the </w:t>
+      </w:r>
+      <w:r>
+        <w:t>“</w:t>
+      </w:r>
+      <w:r>
+        <w:rPr>
+          <w:b/>
+        </w:rPr>
+        <w:t>bin files</w:t>
+      </w:r>
+      <w:r>
+        <w:rPr>
+          <w:b/>
+        </w:rPr>
+        <w:t>”</w:t>
+      </w:r>
+      <w:r>
+        <w:t xml:space="preserve"> in the following order and insert the </w:t>
+      </w:r>
+      <w:r>
+        <w:t>“</w:t>
+      </w:r>
+      <w:r>
+        <w:rPr>
+          <w:b/>
+        </w:rPr>
+        <w:t>values</w:t>
+      </w:r>
+      <w:r>
+        <w:rPr>
+          <w:b/>
+        </w:rPr>
+        <w:t>”</w:t>
+      </w:r>
+      <w:r>
+        <w:t xml:space="preserve"> as shown below.</w:t>
       </w:r>
     </w:p>
     <w:p>
@@ -877,10 +782,10 @@
           <w:noProof/>
         </w:rPr>
         <w:drawing>
-          <wp:inline distT="0" distB="0" distL="0" distR="0" wp14:anchorId="5B54E662" wp14:editId="46C0ABED">
-            <wp:extent cx="5022850" cy="3756674"/>
-            <wp:effectExtent l="0" t="0" r="6350" b="0"/>
-            <wp:docPr id="169555498" name="Picture 169555498"/>
+          <wp:inline distT="0" distB="0" distL="0" distR="0" wp14:anchorId="5ACFFF2F" wp14:editId="28102712">
+            <wp:extent cx="6199909" cy="1692059"/>
+            <wp:effectExtent l="0" t="0" r="0" b="0"/>
+            <wp:docPr id="1894036528" name="Picture 1894036528"/>
             <wp:cNvGraphicFramePr>
               <a:graphicFrameLocks xmlns:a="http://schemas.openxmlformats.org/drawingml/2006/main" noChangeAspect="1"/>
             </wp:cNvGraphicFramePr>
@@ -906,7 +811,7 @@
                   <pic:spPr>
                     <a:xfrm>
                       <a:off x="0" y="0"/>
-                      <a:ext cx="5099827" cy="3814246"/>
+                      <a:ext cx="6199909" cy="1692059"/>
                     </a:xfrm>
                     <a:prstGeom prst="rect">
                       <a:avLst/>
@@ -921,23 +826,17 @@
     </w:p>
     <w:p>
       <w:pPr>
-        <w:jc w:val="both"/>
-      </w:pPr>
-      <w:r>
-        <w:lastRenderedPageBreak/>
-        <w:t>The following message shows that the firmware upload successfully!</w:t>
-      </w:r>
-    </w:p>
-    <w:p>
+        <w:jc w:val="center"/>
+      </w:pPr>
       <w:r>
         <w:rPr>
           <w:noProof/>
         </w:rPr>
         <w:drawing>
-          <wp:inline distT="0" distB="0" distL="0" distR="0" wp14:anchorId="336A560B" wp14:editId="4ECAEC5E">
-            <wp:extent cx="6033222" cy="1608859"/>
-            <wp:effectExtent l="0" t="0" r="0" b="0"/>
-            <wp:docPr id="230373516" name="Picture 230373516"/>
+          <wp:inline distT="0" distB="0" distL="0" distR="0" wp14:anchorId="4F7FBF69" wp14:editId="4EB8B567">
+            <wp:extent cx="2968307" cy="1948818"/>
+            <wp:effectExtent l="0" t="0" r="3810" b="0"/>
+            <wp:docPr id="2026176566" name="Picture 2026176566"/>
             <wp:cNvGraphicFramePr>
               <a:graphicFrameLocks xmlns:a="http://schemas.openxmlformats.org/drawingml/2006/main" noChangeAspect="1"/>
             </wp:cNvGraphicFramePr>
@@ -963,6 +862,131 @@
                   <pic:spPr>
                     <a:xfrm>
                       <a:off x="0" y="0"/>
+                      <a:ext cx="2993029" cy="1965049"/>
+                    </a:xfrm>
+                    <a:prstGeom prst="rect">
+                      <a:avLst/>
+                    </a:prstGeom>
+                  </pic:spPr>
+                </pic:pic>
+              </a:graphicData>
+            </a:graphic>
+          </wp:inline>
+        </w:drawing>
+      </w:r>
+    </w:p>
+    <w:p>
+      <w:pPr>
+        <w:jc w:val="both"/>
+      </w:pPr>
+      <w:r>
+        <w:t>Click on the “</w:t>
+      </w:r>
+      <w:r>
+        <w:rPr>
+          <w:b/>
+        </w:rPr>
+        <w:t>Start</w:t>
+      </w:r>
+      <w:r>
+        <w:t>” button &amp; the firmware begins uploading.</w:t>
+      </w:r>
+    </w:p>
+    <w:p>
+      <w:pPr>
+        <w:jc w:val="center"/>
+      </w:pPr>
+      <w:r>
+        <w:rPr>
+          <w:noProof/>
+        </w:rPr>
+        <w:drawing>
+          <wp:inline distT="0" distB="0" distL="0" distR="0" wp14:anchorId="5B54E662" wp14:editId="46C0ABED">
+            <wp:extent cx="5022850" cy="3756674"/>
+            <wp:effectExtent l="0" t="0" r="6350" b="0"/>
+            <wp:docPr id="169555498" name="Picture 169555498"/>
+            <wp:cNvGraphicFramePr>
+              <a:graphicFrameLocks xmlns:a="http://schemas.openxmlformats.org/drawingml/2006/main" noChangeAspect="1"/>
+            </wp:cNvGraphicFramePr>
+            <a:graphic xmlns:a="http://schemas.openxmlformats.org/drawingml/2006/main">
+              <a:graphicData uri="http://schemas.openxmlformats.org/drawingml/2006/picture">
+                <pic:pic xmlns:pic="http://schemas.openxmlformats.org/drawingml/2006/picture">
+                  <pic:nvPicPr>
+                    <pic:cNvPr id="0" name=""/>
+                    <pic:cNvPicPr/>
+                  </pic:nvPicPr>
+                  <pic:blipFill>
+                    <a:blip r:embed="rId16">
+                      <a:extLst>
+                        <a:ext uri="{28A0092B-C50C-407E-A947-70E740481C1C}">
+                          <a14:useLocalDpi xmlns:a14="http://schemas.microsoft.com/office/drawing/2010/main" val="0"/>
+                        </a:ext>
+                      </a:extLst>
+                    </a:blip>
+                    <a:stretch>
+                      <a:fillRect/>
+                    </a:stretch>
+                  </pic:blipFill>
+                  <pic:spPr>
+                    <a:xfrm>
+                      <a:off x="0" y="0"/>
+                      <a:ext cx="5099827" cy="3814246"/>
+                    </a:xfrm>
+                    <a:prstGeom prst="rect">
+                      <a:avLst/>
+                    </a:prstGeom>
+                  </pic:spPr>
+                </pic:pic>
+              </a:graphicData>
+            </a:graphic>
+          </wp:inline>
+        </w:drawing>
+      </w:r>
+    </w:p>
+    <w:p>
+      <w:pPr>
+        <w:jc w:val="both"/>
+      </w:pPr>
+      <w:r>
+        <w:lastRenderedPageBreak/>
+        <w:t>The following message shows that the firmware upload successfully!</w:t>
+      </w:r>
+    </w:p>
+    <w:p>
+      <w:r>
+        <w:rPr>
+          <w:noProof/>
+        </w:rPr>
+        <w:drawing>
+          <wp:inline distT="0" distB="0" distL="0" distR="0" wp14:anchorId="336A560B" wp14:editId="4ECAEC5E">
+            <wp:extent cx="6033222" cy="1608859"/>
+            <wp:effectExtent l="0" t="0" r="0" b="0"/>
+            <wp:docPr id="230373516" name="Picture 230373516"/>
+            <wp:cNvGraphicFramePr>
+              <a:graphicFrameLocks xmlns:a="http://schemas.openxmlformats.org/drawingml/2006/main" noChangeAspect="1"/>
+            </wp:cNvGraphicFramePr>
+            <a:graphic xmlns:a="http://schemas.openxmlformats.org/drawingml/2006/main">
+              <a:graphicData uri="http://schemas.openxmlformats.org/drawingml/2006/picture">
+                <pic:pic xmlns:pic="http://schemas.openxmlformats.org/drawingml/2006/picture">
+                  <pic:nvPicPr>
+                    <pic:cNvPr id="0" name=""/>
+                    <pic:cNvPicPr/>
+                  </pic:nvPicPr>
+                  <pic:blipFill>
+                    <a:blip r:embed="rId17">
+                      <a:extLst>
+                        <a:ext uri="{28A0092B-C50C-407E-A947-70E740481C1C}">
+                          <a14:useLocalDpi xmlns:a14="http://schemas.microsoft.com/office/drawing/2010/main" val="0"/>
+                        </a:ext>
+                      </a:extLst>
+                    </a:blip>
+                    <a:stretch>
+                      <a:fillRect/>
+                    </a:stretch>
+                  </pic:blipFill>
+                  <pic:spPr>
+                    <a:xfrm>
+                      <a:off x="0" y="0"/>
                       <a:ext cx="6033222" cy="1608859"/>
                     </a:xfrm>
                     <a:prstGeom prst="rect">
@@ -1053,8 +1077,8 @@
             <v:path o:extrusionok="f" gradientshapeok="t" o:connecttype="rect"/>
             <o:lock v:ext="edit" aspectratio="t"/>
           </v:shapetype>
-          <v:shape id="_x0000_i1029" type="#_x0000_t75" style="width:490pt;height:200pt">
-            <v:imagedata r:id="rId16" o:title="test"/>
+          <v:shape id="_x0000_i1025" type="#_x0000_t75" style="width:490.5pt;height:200.25pt">
+            <v:imagedata r:id="rId18" o:title="test"/>
           </v:shape>
         </w:pict>
       </w:r>
@@ -1124,19 +1148,17 @@
       <w:pPr>
         <w:jc w:val="center"/>
       </w:pPr>
-      <w:bookmarkStart w:id="0" w:name="_GoBack"/>
       <w:r>
         <w:rPr>
           <w:b/>
           <w:noProof/>
         </w:rPr>
         <w:pict w14:anchorId="65054238">
-          <v:shape id="_x0000_i1048" type="#_x0000_t75" style="width:404pt;height:168.5pt">
-            <v:imagedata r:id="rId17" o:title="image (4)"/>
+          <v:shape id="_x0000_i1026" type="#_x0000_t75" style="width:403.5pt;height:168.75pt">
+            <v:imagedata r:id="rId19" o:title="image (4)"/>
           </v:shape>
         </w:pict>
       </w:r>
-      <w:bookmarkEnd w:id="0"/>
     </w:p>
     <w:sectPr>
       <w:pgSz w:w="12240" w:h="15840"/>
@@ -1868,6 +1890,29 @@
       <w:contextualSpacing/>
     </w:pPr>
   </w:style>
+  <w:style w:type="character" w:styleId="Hyperlink">
+    <w:name w:val="Hyperlink"/>
+    <w:basedOn w:val="DefaultParagraphFont"/>
+    <w:uiPriority w:val="99"/>
+    <w:unhideWhenUsed/>
+    <w:rsid w:val="00BC6C29"/>
+    <w:rPr>
+      <w:color w:val="0563C1" w:themeColor="hyperlink"/>
+      <w:u w:val="single"/>
+    </w:rPr>
+  </w:style>
+  <w:style w:type="character" w:styleId="FollowedHyperlink">
+    <w:name w:val="FollowedHyperlink"/>
+    <w:basedOn w:val="DefaultParagraphFont"/>
+    <w:uiPriority w:val="99"/>
+    <w:semiHidden/>
+    <w:unhideWhenUsed/>
+    <w:rsid w:val="00BC6C29"/>
+    <w:rPr>
+      <w:color w:val="954F72" w:themeColor="followedHyperlink"/>
+      <w:u w:val="single"/>
+    </w:rPr>
+  </w:style>
 </w:styles>
 </file>
 

</xml_diff>